<commit_message>
docs(team-summary): all-dedicated 10-person team (v1.2)
Per client request, the 5 previously-shared resources (Network/Systems,
HMIS App Support, Security, Account Manager, Engineering Lead) are
upgraded to 100% dedicated. The team is now 10 fully dedicated FTEs
with no shared allocations.

Cost impact:
  Salary cost   ₹6.18L  → ₹11.95L  (+₹5.77L)
  Direct cost   ₹7.67L  → ₹13.44L
  Service fee   ₹10.90L → ₹19.10L  (excl. GST)
  Service fee   ₹12.86L → ₹22.54L  (incl. 18% GST)
  Run rate      ₹16.87L → ₹26.55L  per month
  ACV           ₹2.02 cr → ₹3.18 cr

Both .md source and pandoc-generated .docx updated.

Co-Authored-By: Claude Opus 4.7 (1M context) <noreply@anthropic.com>
</commit_message>
<xml_diff>
--- a/docs/proposals/Managed-IT-Team-Summary.docx
+++ b/docs/proposals/Managed-IT-Team-Summary.docx
@@ -26,7 +26,7 @@
         <w:t xml:space="preserve">May 2026</w:t>
       </w:r>
     </w:p>
-    <w:bookmarkStart w:id="26" w:name="managed-it-services-team-summary-kras"/>
+    <w:bookmarkStart w:id="25" w:name="managed-it-services-team-summary-kras"/>
     <w:p>
       <w:pPr>
         <w:pStyle w:val="Heading1"/>
@@ -88,13 +88,29 @@
           <w:b/>
           <w:bCs/>
         </w:rPr>
-        <w:t xml:space="preserve">Updated:</w:t>
+        <w:t xml:space="preserve">Updated in v1.2:</w:t>
       </w:r>
       <w:r>
         <w:t xml:space="preserve"> </w:t>
       </w:r>
       <w:r>
-        <w:t xml:space="preserve">Dedicated DevOps engineer added (previously 30% shared, now 100% allocated)</w:t>
+        <w:t xml:space="preserve">All previously-shared resources are now</w:t>
+      </w:r>
+      <w:r>
+        <w:t xml:space="preserve"> </w:t>
+      </w:r>
+      <w:r>
+        <w:rPr>
+          <w:b/>
+          <w:bCs/>
+        </w:rPr>
+        <w:t xml:space="preserve">dedicated full-time</w:t>
+      </w:r>
+      <w:r>
+        <w:t xml:space="preserve"> </w:t>
+      </w:r>
+      <w:r>
+        <w:t xml:space="preserve">to this engagement. The team is now 10 fully dedicated FTEs with no shared allocations. Cost and SLA targets have been updated accordingly.</w:t>
       </w:r>
     </w:p>
     <w:p>
@@ -142,7 +158,7 @@
         <w:pStyle w:val="BodyText"/>
       </w:pPr>
       <w:r>
-        <w:t xml:space="preserve">The engagement is delivered by an</w:t>
+        <w:t xml:space="preserve">The engagement is delivered by a</w:t>
       </w:r>
       <w:r>
         <w:t xml:space="preserve"> </w:t>
@@ -152,29 +168,13 @@
           <w:b/>
           <w:bCs/>
         </w:rPr>
-        <w:t xml:space="preserve">11-person team</w:t>
+        <w:t xml:space="preserve">10-person dedicated team</w:t>
       </w:r>
       <w:r>
         <w:t xml:space="preserve"> </w:t>
       </w:r>
       <w:r>
-        <w:t xml:space="preserve">(5 dedicated, 6 shared) totalling approximately</w:t>
-      </w:r>
-      <w:r>
-        <w:t xml:space="preserve"> </w:t>
-      </w:r>
-      <w:r>
-        <w:rPr>
-          <w:b/>
-          <w:bCs/>
-        </w:rPr>
-        <w:t xml:space="preserve">7.3 effective full-time equivalents (FTE)</w:t>
-      </w:r>
-      <w:r>
-        <w:t xml:space="preserve"> </w:t>
-      </w:r>
-      <w:r>
-        <w:t xml:space="preserve">allocated to the hospital. The team blends an onsite presence for clinical-area white-glove support with remote specialists for L2/L3 escalations, security operations, and engineering leadership.</w:t>
+        <w:t xml:space="preserve">— every member works exclusively for Busitema Referral Hospital, eliminating any context-switching across multiple clients. The team blends an onsite presence for clinical-area white-glove support with dedicated remote specialists for L2/L3 escalations, security operations, application support, account governance, and engineering leadership.</w:t>
       </w:r>
     </w:p>
     <w:p>
@@ -219,7 +219,11 @@
               <w:pStyle w:val="Compact"/>
             </w:pPr>
             <w:r>
-              <w:t xml:space="preserve">11 people</w:t>
+              <w:rPr>
+                <w:b/>
+                <w:bCs/>
+              </w:rPr>
+              <w:t xml:space="preserve">10 people</w:t>
             </w:r>
           </w:p>
         </w:tc>
@@ -243,7 +247,11 @@
               <w:pStyle w:val="Compact"/>
             </w:pPr>
             <w:r>
-              <w:t xml:space="preserve">7.3</w:t>
+              <w:rPr>
+                <w:b/>
+                <w:bCs/>
+              </w:rPr>
+              <w:t xml:space="preserve">10.0 FTE (all dedicated)</w:t>
             </w:r>
           </w:p>
         </w:tc>
@@ -267,7 +275,7 @@
               <w:pStyle w:val="Compact"/>
             </w:pPr>
             <w:r>
-              <w:t xml:space="preserve">₹6,18,000</w:t>
+              <w:t xml:space="preserve">₹11,95,000</w:t>
             </w:r>
           </w:p>
         </w:tc>
@@ -315,7 +323,7 @@
               <w:pStyle w:val="Compact"/>
             </w:pPr>
             <w:r>
-              <w:t xml:space="preserve">₹7,67,000</w:t>
+              <w:t xml:space="preserve">₹13,44,000</w:t>
             </w:r>
           </w:p>
         </w:tc>
@@ -339,7 +347,7 @@
               <w:pStyle w:val="Compact"/>
             </w:pPr>
             <w:r>
-              <w:t xml:space="preserve">₹3,23,000</w:t>
+              <w:t xml:space="preserve">₹5,66,000</w:t>
             </w:r>
           </w:p>
         </w:tc>
@@ -371,7 +379,7 @@
                 <w:b/>
                 <w:bCs/>
               </w:rPr>
-              <w:t xml:space="preserve">₹10,90,000</w:t>
+              <w:t xml:space="preserve">₹19,10,000</w:t>
             </w:r>
           </w:p>
         </w:tc>
@@ -403,7 +411,7 @@
                 <w:b/>
                 <w:bCs/>
               </w:rPr>
-              <w:t xml:space="preserve">₹12,86,200</w:t>
+              <w:t xml:space="preserve">₹22,53,800</w:t>
             </w:r>
           </w:p>
         </w:tc>
@@ -459,7 +467,7 @@
                 <w:b/>
                 <w:bCs/>
               </w:rPr>
-              <w:t xml:space="preserve">~₹16,87,000</w:t>
+              <w:t xml:space="preserve">~₹26,55,000</w:t>
             </w:r>
           </w:p>
         </w:tc>
@@ -491,7 +499,7 @@
                 <w:b/>
                 <w:bCs/>
               </w:rPr>
-              <w:t xml:space="preserve">~₹2.02 crore</w:t>
+              <w:t xml:space="preserve">~₹3.18 crore</w:t>
             </w:r>
           </w:p>
         </w:tc>
@@ -502,7 +510,7 @@
         <w:pStyle w:val="BlockText"/>
       </w:pPr>
       <w:r>
-        <w:t xml:space="preserve">The DevOps engineer being upgraded from shared (0.3 FTE) to dedicated (1.0 FTE) increases the managed-services fee by approximately ₹1.15 lakh per month — fully transparent in the cost build-up below.</w:t>
+        <w:t xml:space="preserve">Moving from a 5-dedicated-plus-5-shared model (v1.1) to a fully dedicated 10-person team (v1.2) increases the managed-services fee by approximately ₹8.20 lakh per month. The trade-off in favour of the client: every team member’s full attention, faster SLAs, no cross-client priority conflicts, deeper hospital-specific knowledge, and consistent faces for end-users.</w:t>
       </w:r>
     </w:p>
     <w:p>
@@ -513,22 +521,13 @@
       </w:r>
     </w:p>
     <w:bookmarkEnd w:id="9"/>
-    <w:bookmarkStart w:id="14" w:name="team-list"/>
+    <w:bookmarkStart w:id="12" w:name="team-list-all-dedicated"/>
     <w:p>
       <w:pPr>
         <w:pStyle w:val="Heading2"/>
       </w:pPr>
       <w:r>
-        <w:t xml:space="preserve">2. Team list</w:t>
-      </w:r>
-    </w:p>
-    <w:bookmarkStart w:id="10" w:name="X6fe0d4b91898b6a1c88a3881cfcf908916bd440"/>
-    <w:p>
-      <w:pPr>
-        <w:pStyle w:val="Heading3"/>
-      </w:pPr>
-      <w:r>
-        <w:t xml:space="preserve">2.1 Dedicated team (100% allocated to this engagement)</w:t>
+        <w:t xml:space="preserve">2. Team list — all dedicated</w:t>
       </w:r>
     </w:p>
     <w:p>
@@ -536,7 +535,23 @@
         <w:pStyle w:val="FirstParagraph"/>
       </w:pPr>
       <w:r>
-        <w:t xml:space="preserve">These 5 people work exclusively for Busitema Referral Hospital. Four are physically onsite during operating hours; the DevOps engineer works remotely with periodic onsite presence for major changes and DR drills.</w:t>
+        <w:t xml:space="preserve">Every person below is</w:t>
+      </w:r>
+      <w:r>
+        <w:t xml:space="preserve"> </w:t>
+      </w:r>
+      <w:r>
+        <w:rPr>
+          <w:b/>
+          <w:bCs/>
+        </w:rPr>
+        <w:t xml:space="preserve">100% allocated</w:t>
+      </w:r>
+      <w:r>
+        <w:t xml:space="preserve"> </w:t>
+      </w:r>
+      <w:r>
+        <w:t xml:space="preserve">to Busitema Referral Hospital. None of these resources work for any other client.</w:t>
       </w:r>
     </w:p>
     <w:tbl>
@@ -547,13 +562,12 @@
         <w:tblLook w:firstRow="1" w:lastRow="0" w:firstColumn="0" w:lastColumn="0" w:noHBand="0" w:noVBand="0" w:val="0020"/>
       </w:tblPr>
       <w:tblGrid>
-        <w:gridCol w:w="232"/>
-        <w:gridCol w:w="1009"/>
-        <w:gridCol w:w="854"/>
-        <w:gridCol w:w="1320"/>
-        <w:gridCol w:w="1630"/>
-        <w:gridCol w:w="1475"/>
-        <w:gridCol w:w="1397"/>
+        <w:gridCol w:w="286"/>
+        <w:gridCol w:w="1240"/>
+        <w:gridCol w:w="1049"/>
+        <w:gridCol w:w="1622"/>
+        <w:gridCol w:w="2003"/>
+        <w:gridCol w:w="1717"/>
       </w:tblGrid>
       <w:tr>
         <w:trPr>
@@ -621,17 +635,6 @@
               <w:pStyle w:val="Compact"/>
             </w:pPr>
             <w:r>
-              <w:t xml:space="preserve">Allocated /mo (₹)</w:t>
-            </w:r>
-          </w:p>
-        </w:tc>
-        <w:tc>
-          <w:tcPr/>
-          <w:p>
-            <w:pPr>
-              <w:pStyle w:val="Compact"/>
-            </w:pPr>
-            <w:r>
               <w:t xml:space="preserve">Onsite / Remote</w:t>
             </w:r>
           </w:p>
@@ -700,6 +703,403 @@
               <w:pStyle w:val="Compact"/>
             </w:pPr>
             <w:r>
+              <w:t xml:space="preserve">Onsite, Mon–Sat</w:t>
+            </w:r>
+          </w:p>
+        </w:tc>
+      </w:tr>
+      <w:tr>
+        <w:tc>
+          <w:tcPr/>
+          <w:p>
+            <w:pPr>
+              <w:pStyle w:val="Compact"/>
+            </w:pPr>
+            <w:r>
+              <w:t xml:space="preserve">2</w:t>
+            </w:r>
+          </w:p>
+        </w:tc>
+        <w:tc>
+          <w:tcPr/>
+          <w:p>
+            <w:pPr>
+              <w:pStyle w:val="Compact"/>
+            </w:pPr>
+            <w:r>
+              <w:t xml:space="preserve">L1 Helpdesk Engineer — Shift A (9 AM – 3 PM)</w:t>
+            </w:r>
+          </w:p>
+        </w:tc>
+        <w:tc>
+          <w:tcPr/>
+          <w:p>
+            <w:pPr>
+              <w:pStyle w:val="Compact"/>
+            </w:pPr>
+            <w:r>
+              <w:t xml:space="preserve">1</w:t>
+            </w:r>
+          </w:p>
+        </w:tc>
+        <w:tc>
+          <w:tcPr/>
+          <w:p>
+            <w:pPr>
+              <w:pStyle w:val="Compact"/>
+            </w:pPr>
+            <w:r>
+              <w:t xml:space="preserve">32,000</w:t>
+            </w:r>
+          </w:p>
+        </w:tc>
+        <w:tc>
+          <w:tcPr/>
+          <w:p>
+            <w:pPr>
+              <w:pStyle w:val="Compact"/>
+            </w:pPr>
+            <w:r>
+              <w:t xml:space="preserve">46,000</w:t>
+            </w:r>
+          </w:p>
+        </w:tc>
+        <w:tc>
+          <w:tcPr/>
+          <w:p>
+            <w:pPr>
+              <w:pStyle w:val="Compact"/>
+            </w:pPr>
+            <w:r>
+              <w:t xml:space="preserve">Onsite</w:t>
+            </w:r>
+          </w:p>
+        </w:tc>
+      </w:tr>
+      <w:tr>
+        <w:tc>
+          <w:tcPr/>
+          <w:p>
+            <w:pPr>
+              <w:pStyle w:val="Compact"/>
+            </w:pPr>
+            <w:r>
+              <w:t xml:space="preserve">3</w:t>
+            </w:r>
+          </w:p>
+        </w:tc>
+        <w:tc>
+          <w:tcPr/>
+          <w:p>
+            <w:pPr>
+              <w:pStyle w:val="Compact"/>
+            </w:pPr>
+            <w:r>
+              <w:t xml:space="preserve">L1 Helpdesk Engineer — Shift B (3 PM – 9 PM)</w:t>
+            </w:r>
+          </w:p>
+        </w:tc>
+        <w:tc>
+          <w:tcPr/>
+          <w:p>
+            <w:pPr>
+              <w:pStyle w:val="Compact"/>
+            </w:pPr>
+            <w:r>
+              <w:t xml:space="preserve">1</w:t>
+            </w:r>
+          </w:p>
+        </w:tc>
+        <w:tc>
+          <w:tcPr/>
+          <w:p>
+            <w:pPr>
+              <w:pStyle w:val="Compact"/>
+            </w:pPr>
+            <w:r>
+              <w:t xml:space="preserve">32,000</w:t>
+            </w:r>
+          </w:p>
+        </w:tc>
+        <w:tc>
+          <w:tcPr/>
+          <w:p>
+            <w:pPr>
+              <w:pStyle w:val="Compact"/>
+            </w:pPr>
+            <w:r>
+              <w:t xml:space="preserve">46,000</w:t>
+            </w:r>
+          </w:p>
+        </w:tc>
+        <w:tc>
+          <w:tcPr/>
+          <w:p>
+            <w:pPr>
+              <w:pStyle w:val="Compact"/>
+            </w:pPr>
+            <w:r>
+              <w:t xml:space="preserve">Onsite</w:t>
+            </w:r>
+          </w:p>
+        </w:tc>
+      </w:tr>
+      <w:tr>
+        <w:tc>
+          <w:tcPr/>
+          <w:p>
+            <w:pPr>
+              <w:pStyle w:val="Compact"/>
+            </w:pPr>
+            <w:r>
+              <w:t xml:space="preserve">4</w:t>
+            </w:r>
+          </w:p>
+        </w:tc>
+        <w:tc>
+          <w:tcPr/>
+          <w:p>
+            <w:pPr>
+              <w:pStyle w:val="Compact"/>
+            </w:pPr>
+            <w:r>
+              <w:t xml:space="preserve">L1 Helpdesk Engineer — Rotation / Backup</w:t>
+            </w:r>
+          </w:p>
+        </w:tc>
+        <w:tc>
+          <w:tcPr/>
+          <w:p>
+            <w:pPr>
+              <w:pStyle w:val="Compact"/>
+            </w:pPr>
+            <w:r>
+              <w:t xml:space="preserve">1</w:t>
+            </w:r>
+          </w:p>
+        </w:tc>
+        <w:tc>
+          <w:tcPr/>
+          <w:p>
+            <w:pPr>
+              <w:pStyle w:val="Compact"/>
+            </w:pPr>
+            <w:r>
+              <w:t xml:space="preserve">32,000</w:t>
+            </w:r>
+          </w:p>
+        </w:tc>
+        <w:tc>
+          <w:tcPr/>
+          <w:p>
+            <w:pPr>
+              <w:pStyle w:val="Compact"/>
+            </w:pPr>
+            <w:r>
+              <w:t xml:space="preserve">46,000</w:t>
+            </w:r>
+          </w:p>
+        </w:tc>
+        <w:tc>
+          <w:tcPr/>
+          <w:p>
+            <w:pPr>
+              <w:pStyle w:val="Compact"/>
+            </w:pPr>
+            <w:r>
+              <w:t xml:space="preserve">Onsite (rotation, weekends, leave-cover)</w:t>
+            </w:r>
+          </w:p>
+        </w:tc>
+      </w:tr>
+      <w:tr>
+        <w:tc>
+          <w:tcPr/>
+          <w:p>
+            <w:pPr>
+              <w:pStyle w:val="Compact"/>
+            </w:pPr>
+            <w:r>
+              <w:t xml:space="preserve">5</w:t>
+            </w:r>
+          </w:p>
+        </w:tc>
+        <w:tc>
+          <w:tcPr/>
+          <w:p>
+            <w:pPr>
+              <w:pStyle w:val="Compact"/>
+            </w:pPr>
+            <w:r>
+              <w:t xml:space="preserve">Cloud / DevOps Engineer</w:t>
+            </w:r>
+          </w:p>
+        </w:tc>
+        <w:tc>
+          <w:tcPr/>
+          <w:p>
+            <w:pPr>
+              <w:pStyle w:val="Compact"/>
+            </w:pPr>
+            <w:r>
+              <w:t xml:space="preserve">1</w:t>
+            </w:r>
+          </w:p>
+        </w:tc>
+        <w:tc>
+          <w:tcPr/>
+          <w:p>
+            <w:pPr>
+              <w:pStyle w:val="Compact"/>
+            </w:pPr>
+            <w:r>
+              <w:t xml:space="preserve">85,000</w:t>
+            </w:r>
+          </w:p>
+        </w:tc>
+        <w:tc>
+          <w:tcPr/>
+          <w:p>
+            <w:pPr>
+              <w:pStyle w:val="Compact"/>
+            </w:pPr>
+            <w:r>
+              <w:t xml:space="preserve">1,17,000</w:t>
+            </w:r>
+          </w:p>
+        </w:tc>
+        <w:tc>
+          <w:tcPr/>
+          <w:p>
+            <w:pPr>
+              <w:pStyle w:val="Compact"/>
+            </w:pPr>
+            <w:r>
+              <w:t xml:space="preserve">Remote + onsite for major changes/DR</w:t>
+            </w:r>
+          </w:p>
+        </w:tc>
+      </w:tr>
+      <w:tr>
+        <w:tc>
+          <w:tcPr/>
+          <w:p>
+            <w:pPr>
+              <w:pStyle w:val="Compact"/>
+            </w:pPr>
+            <w:r>
+              <w:t xml:space="preserve">6</w:t>
+            </w:r>
+          </w:p>
+        </w:tc>
+        <w:tc>
+          <w:tcPr/>
+          <w:p>
+            <w:pPr>
+              <w:pStyle w:val="Compact"/>
+            </w:pPr>
+            <w:r>
+              <w:t xml:space="preserve">Network &amp; Systems Engineer (L2)</w:t>
+            </w:r>
+          </w:p>
+        </w:tc>
+        <w:tc>
+          <w:tcPr/>
+          <w:p>
+            <w:pPr>
+              <w:pStyle w:val="Compact"/>
+            </w:pPr>
+            <w:r>
+              <w:t xml:space="preserve">1</w:t>
+            </w:r>
+          </w:p>
+        </w:tc>
+        <w:tc>
+          <w:tcPr/>
+          <w:p>
+            <w:pPr>
+              <w:pStyle w:val="Compact"/>
+            </w:pPr>
+            <w:r>
+              <w:t xml:space="preserve">95,000</w:t>
+            </w:r>
+          </w:p>
+        </w:tc>
+        <w:tc>
+          <w:tcPr/>
+          <w:p>
+            <w:pPr>
+              <w:pStyle w:val="Compact"/>
+            </w:pPr>
+            <w:r>
+              <w:t xml:space="preserve">1,30,000</w:t>
+            </w:r>
+          </w:p>
+        </w:tc>
+        <w:tc>
+          <w:tcPr/>
+          <w:p>
+            <w:pPr>
+              <w:pStyle w:val="Compact"/>
+            </w:pPr>
+            <w:r>
+              <w:t xml:space="preserve">Hybrid (onsite for changes, remote ops)</w:t>
+            </w:r>
+          </w:p>
+        </w:tc>
+      </w:tr>
+      <w:tr>
+        <w:tc>
+          <w:tcPr/>
+          <w:p>
+            <w:pPr>
+              <w:pStyle w:val="Compact"/>
+            </w:pPr>
+            <w:r>
+              <w:t xml:space="preserve">7</w:t>
+            </w:r>
+          </w:p>
+        </w:tc>
+        <w:tc>
+          <w:tcPr/>
+          <w:p>
+            <w:pPr>
+              <w:pStyle w:val="Compact"/>
+            </w:pPr>
+            <w:r>
+              <w:t xml:space="preserve">HospitalPro Application Support Engineer</w:t>
+            </w:r>
+          </w:p>
+        </w:tc>
+        <w:tc>
+          <w:tcPr/>
+          <w:p>
+            <w:pPr>
+              <w:pStyle w:val="Compact"/>
+            </w:pPr>
+            <w:r>
+              <w:t xml:space="preserve">1</w:t>
+            </w:r>
+          </w:p>
+        </w:tc>
+        <w:tc>
+          <w:tcPr/>
+          <w:p>
+            <w:pPr>
+              <w:pStyle w:val="Compact"/>
+            </w:pPr>
+            <w:r>
+              <w:t xml:space="preserve">1,00,000</w:t>
+            </w:r>
+          </w:p>
+        </w:tc>
+        <w:tc>
+          <w:tcPr/>
+          <w:p>
+            <w:pPr>
+              <w:pStyle w:val="Compact"/>
+            </w:pPr>
+            <w:r>
               <w:t xml:space="preserve">1,40,000</w:t>
             </w:r>
           </w:p>
@@ -711,31 +1111,31 @@
               <w:pStyle w:val="Compact"/>
             </w:pPr>
             <w:r>
-              <w:t xml:space="preserve">Onsite, Mon–Sat</w:t>
-            </w:r>
-          </w:p>
-        </w:tc>
-      </w:tr>
-      <w:tr>
-        <w:tc>
-          <w:tcPr/>
-          <w:p>
-            <w:pPr>
-              <w:pStyle w:val="Compact"/>
-            </w:pPr>
-            <w:r>
-              <w:t xml:space="preserve">2</w:t>
-            </w:r>
-          </w:p>
-        </w:tc>
-        <w:tc>
-          <w:tcPr/>
-          <w:p>
-            <w:pPr>
-              <w:pStyle w:val="Compact"/>
-            </w:pPr>
-            <w:r>
-              <w:t xml:space="preserve">L1 Helpdesk Engineer — Shift A (9 AM – 3 PM)</w:t>
+              <w:t xml:space="preserve">Remote</w:t>
+            </w:r>
+          </w:p>
+        </w:tc>
+      </w:tr>
+      <w:tr>
+        <w:tc>
+          <w:tcPr/>
+          <w:p>
+            <w:pPr>
+              <w:pStyle w:val="Compact"/>
+            </w:pPr>
+            <w:r>
+              <w:t xml:space="preserve">8</w:t>
+            </w:r>
+          </w:p>
+        </w:tc>
+        <w:tc>
+          <w:tcPr/>
+          <w:p>
+            <w:pPr>
+              <w:pStyle w:val="Compact"/>
+            </w:pPr>
+            <w:r>
+              <w:t xml:space="preserve">Security Analyst</w:t>
             </w:r>
           </w:p>
         </w:tc>
@@ -757,64 +1157,53 @@
               <w:pStyle w:val="Compact"/>
             </w:pPr>
             <w:r>
-              <w:t xml:space="preserve">32,000</w:t>
-            </w:r>
-          </w:p>
-        </w:tc>
-        <w:tc>
-          <w:tcPr/>
-          <w:p>
-            <w:pPr>
-              <w:pStyle w:val="Compact"/>
-            </w:pPr>
-            <w:r>
-              <w:t xml:space="preserve">46,000</w:t>
-            </w:r>
-          </w:p>
-        </w:tc>
-        <w:tc>
-          <w:tcPr/>
-          <w:p>
-            <w:pPr>
-              <w:pStyle w:val="Compact"/>
-            </w:pPr>
-            <w:r>
-              <w:t xml:space="preserve">46,000</w:t>
-            </w:r>
-          </w:p>
-        </w:tc>
-        <w:tc>
-          <w:tcPr/>
-          <w:p>
-            <w:pPr>
-              <w:pStyle w:val="Compact"/>
-            </w:pPr>
-            <w:r>
-              <w:t xml:space="preserve">Onsite</w:t>
-            </w:r>
-          </w:p>
-        </w:tc>
-      </w:tr>
-      <w:tr>
-        <w:tc>
-          <w:tcPr/>
-          <w:p>
-            <w:pPr>
-              <w:pStyle w:val="Compact"/>
-            </w:pPr>
-            <w:r>
-              <w:t xml:space="preserve">3</w:t>
-            </w:r>
-          </w:p>
-        </w:tc>
-        <w:tc>
-          <w:tcPr/>
-          <w:p>
-            <w:pPr>
-              <w:pStyle w:val="Compact"/>
-            </w:pPr>
-            <w:r>
-              <w:t xml:space="preserve">L1 Helpdesk Engineer — Shift B (3 PM – 9 PM)</w:t>
+              <w:t xml:space="preserve">1,00,000</w:t>
+            </w:r>
+          </w:p>
+        </w:tc>
+        <w:tc>
+          <w:tcPr/>
+          <w:p>
+            <w:pPr>
+              <w:pStyle w:val="Compact"/>
+            </w:pPr>
+            <w:r>
+              <w:t xml:space="preserve">1,40,000</w:t>
+            </w:r>
+          </w:p>
+        </w:tc>
+        <w:tc>
+          <w:tcPr/>
+          <w:p>
+            <w:pPr>
+              <w:pStyle w:val="Compact"/>
+            </w:pPr>
+            <w:r>
+              <w:t xml:space="preserve">Remote (SOC)</w:t>
+            </w:r>
+          </w:p>
+        </w:tc>
+      </w:tr>
+      <w:tr>
+        <w:tc>
+          <w:tcPr/>
+          <w:p>
+            <w:pPr>
+              <w:pStyle w:val="Compact"/>
+            </w:pPr>
+            <w:r>
+              <w:t xml:space="preserve">9</w:t>
+            </w:r>
+          </w:p>
+        </w:tc>
+        <w:tc>
+          <w:tcPr/>
+          <w:p>
+            <w:pPr>
+              <w:pStyle w:val="Compact"/>
+            </w:pPr>
+            <w:r>
+              <w:t xml:space="preserve">Account Manager / Service Delivery</w:t>
             </w:r>
           </w:p>
         </w:tc>
@@ -836,64 +1225,53 @@
               <w:pStyle w:val="Compact"/>
             </w:pPr>
             <w:r>
-              <w:t xml:space="preserve">32,000</w:t>
-            </w:r>
-          </w:p>
-        </w:tc>
-        <w:tc>
-          <w:tcPr/>
-          <w:p>
-            <w:pPr>
-              <w:pStyle w:val="Compact"/>
-            </w:pPr>
-            <w:r>
-              <w:t xml:space="preserve">46,000</w:t>
-            </w:r>
-          </w:p>
-        </w:tc>
-        <w:tc>
-          <w:tcPr/>
-          <w:p>
-            <w:pPr>
-              <w:pStyle w:val="Compact"/>
-            </w:pPr>
-            <w:r>
-              <w:t xml:space="preserve">46,000</w:t>
-            </w:r>
-          </w:p>
-        </w:tc>
-        <w:tc>
-          <w:tcPr/>
-          <w:p>
-            <w:pPr>
-              <w:pStyle w:val="Compact"/>
-            </w:pPr>
-            <w:r>
-              <w:t xml:space="preserve">Onsite</w:t>
-            </w:r>
-          </w:p>
-        </w:tc>
-      </w:tr>
-      <w:tr>
-        <w:tc>
-          <w:tcPr/>
-          <w:p>
-            <w:pPr>
-              <w:pStyle w:val="Compact"/>
-            </w:pPr>
-            <w:r>
-              <w:t xml:space="preserve">4</w:t>
-            </w:r>
-          </w:p>
-        </w:tc>
-        <w:tc>
-          <w:tcPr/>
-          <w:p>
-            <w:pPr>
-              <w:pStyle w:val="Compact"/>
-            </w:pPr>
-            <w:r>
-              <w:t xml:space="preserve">L1 Helpdesk Engineer — Rotation/Backup (50% on this account)</w:t>
+              <w:t xml:space="preserve">1,00,000</w:t>
+            </w:r>
+          </w:p>
+        </w:tc>
+        <w:tc>
+          <w:tcPr/>
+          <w:p>
+            <w:pPr>
+              <w:pStyle w:val="Compact"/>
+            </w:pPr>
+            <w:r>
+              <w:t xml:space="preserve">1,40,000</w:t>
+            </w:r>
+          </w:p>
+        </w:tc>
+        <w:tc>
+          <w:tcPr/>
+          <w:p>
+            <w:pPr>
+              <w:pStyle w:val="Compact"/>
+            </w:pPr>
+            <w:r>
+              <w:t xml:space="preserve">Remote with monthly onsite QBRs</w:t>
+            </w:r>
+          </w:p>
+        </w:tc>
+      </w:tr>
+      <w:tr>
+        <w:tc>
+          <w:tcPr/>
+          <w:p>
+            <w:pPr>
+              <w:pStyle w:val="Compact"/>
+            </w:pPr>
+            <w:r>
+              <w:t xml:space="preserve">10</w:t>
+            </w:r>
+          </w:p>
+        </w:tc>
+        <w:tc>
+          <w:tcPr/>
+          <w:p>
+            <w:pPr>
+              <w:pStyle w:val="Compact"/>
+            </w:pPr>
+            <w:r>
+              <w:t xml:space="preserve">Engineering Lead (L3/L4 escalation)</w:t>
             </w:r>
           </w:p>
         </w:tc>
@@ -915,54 +1293,40 @@
               <w:pStyle w:val="Compact"/>
             </w:pPr>
             <w:r>
-              <w:t xml:space="preserve">32,000</w:t>
-            </w:r>
-          </w:p>
-        </w:tc>
-        <w:tc>
-          <w:tcPr/>
-          <w:p>
-            <w:pPr>
-              <w:pStyle w:val="Compact"/>
-            </w:pPr>
-            <w:r>
-              <w:t xml:space="preserve">46,000</w:t>
-            </w:r>
-          </w:p>
-        </w:tc>
-        <w:tc>
-          <w:tcPr/>
-          <w:p>
-            <w:pPr>
-              <w:pStyle w:val="Compact"/>
-            </w:pPr>
-            <w:r>
-              <w:t xml:space="preserve">23,000</w:t>
-            </w:r>
-          </w:p>
-        </w:tc>
-        <w:tc>
-          <w:tcPr/>
-          <w:p>
-            <w:pPr>
-              <w:pStyle w:val="Compact"/>
-            </w:pPr>
-            <w:r>
-              <w:t xml:space="preserve">Onsite, rotation</w:t>
-            </w:r>
-          </w:p>
-        </w:tc>
-      </w:tr>
-      <w:tr>
-        <w:tc>
-          <w:tcPr/>
-          <w:p>
-            <w:pPr>
-              <w:pStyle w:val="Compact"/>
-            </w:pPr>
-            <w:r>
-              <w:t xml:space="preserve">5</w:t>
-            </w:r>
+              <w:t xml:space="preserve">1,10,000</w:t>
+            </w:r>
+          </w:p>
+        </w:tc>
+        <w:tc>
+          <w:tcPr/>
+          <w:p>
+            <w:pPr>
+              <w:pStyle w:val="Compact"/>
+            </w:pPr>
+            <w:r>
+              <w:t xml:space="preserve">1,50,000</w:t>
+            </w:r>
+          </w:p>
+        </w:tc>
+        <w:tc>
+          <w:tcPr/>
+          <w:p>
+            <w:pPr>
+              <w:pStyle w:val="Compact"/>
+            </w:pPr>
+            <w:r>
+              <w:t xml:space="preserve">Remote with onsite for major incidents</w:t>
+            </w:r>
+          </w:p>
+        </w:tc>
+      </w:tr>
+      <w:tr>
+        <w:tc>
+          <w:tcPr/>
+          <w:p>
+            <w:pPr>
+              <w:pStyle w:val="Compact"/>
+            </w:pPr>
           </w:p>
         </w:tc>
         <w:tc>
@@ -976,73 +1340,8 @@
                 <w:b/>
                 <w:bCs/>
               </w:rPr>
-              <w:t xml:space="preserve">Cloud / DevOps Engineer (newly dedicated)</w:t>
-            </w:r>
-          </w:p>
-        </w:tc>
-        <w:tc>
-          <w:tcPr/>
-          <w:p>
-            <w:pPr>
-              <w:pStyle w:val="Compact"/>
-            </w:pPr>
-            <w:r>
-              <w:t xml:space="preserve">1</w:t>
-            </w:r>
-          </w:p>
-        </w:tc>
-        <w:tc>
-          <w:tcPr/>
-          <w:p>
-            <w:pPr>
-              <w:pStyle w:val="Compact"/>
-            </w:pPr>
-            <w:r>
-              <w:t xml:space="preserve">85,000</w:t>
-            </w:r>
-          </w:p>
-        </w:tc>
-        <w:tc>
-          <w:tcPr/>
-          <w:p>
-            <w:pPr>
-              <w:pStyle w:val="Compact"/>
-            </w:pPr>
-            <w:r>
-              <w:t xml:space="preserve">1,17,000</w:t>
-            </w:r>
-          </w:p>
-        </w:tc>
-        <w:tc>
-          <w:tcPr/>
-          <w:p>
-            <w:pPr>
-              <w:pStyle w:val="Compact"/>
-            </w:pPr>
-            <w:r>
-              <w:t xml:space="preserve">1,17,000</w:t>
-            </w:r>
-          </w:p>
-        </w:tc>
-        <w:tc>
-          <w:tcPr/>
-          <w:p>
-            <w:pPr>
-              <w:pStyle w:val="Compact"/>
-            </w:pPr>
-            <w:r>
-              <w:t xml:space="preserve">Remote + onsite for major changes</w:t>
-            </w:r>
-          </w:p>
-        </w:tc>
-      </w:tr>
-      <w:tr>
-        <w:tc>
-          <w:tcPr/>
-          <w:p>
-            <w:pPr>
-              <w:pStyle w:val="Compact"/>
-            </w:pPr>
+              <w:t xml:space="preserve">Total — dedicated</w:t>
+            </w:r>
           </w:p>
         </w:tc>
         <w:tc>
@@ -1056,8 +1355,16 @@
                 <w:b/>
                 <w:bCs/>
               </w:rPr>
-              <w:t xml:space="preserve">Subtotal — dedicated</w:t>
-            </w:r>
+              <w:t xml:space="preserve">10 people</w:t>
+            </w:r>
+          </w:p>
+        </w:tc>
+        <w:tc>
+          <w:tcPr/>
+          <w:p>
+            <w:pPr>
+              <w:pStyle w:val="Compact"/>
+            </w:pPr>
           </w:p>
         </w:tc>
         <w:tc>
@@ -1071,38 +1378,7 @@
                 <w:b/>
                 <w:bCs/>
               </w:rPr>
-              <w:t xml:space="preserve">5 people</w:t>
-            </w:r>
-          </w:p>
-        </w:tc>
-        <w:tc>
-          <w:tcPr/>
-          <w:p>
-            <w:pPr>
-              <w:pStyle w:val="Compact"/>
-            </w:pPr>
-          </w:p>
-        </w:tc>
-        <w:tc>
-          <w:tcPr/>
-          <w:p>
-            <w:pPr>
-              <w:pStyle w:val="Compact"/>
-            </w:pPr>
-          </w:p>
-        </w:tc>
-        <w:tc>
-          <w:tcPr/>
-          <w:p>
-            <w:pPr>
-              <w:pStyle w:val="Compact"/>
-            </w:pPr>
-            <w:r>
-              <w:rPr>
-                <w:b/>
-                <w:bCs/>
-              </w:rPr>
-              <w:t xml:space="preserve">₹3,72,000</w:t>
+              <w:t xml:space="preserve">₹11,95,000</w:t>
             </w:r>
           </w:p>
         </w:tc>
@@ -1116,536 +1392,13 @@
         </w:tc>
       </w:tr>
     </w:tbl>
-    <w:bookmarkEnd w:id="10"/>
-    <w:bookmarkStart w:id="11" w:name="shared-team-allocated-by-fte-percentage"/>
+    <w:bookmarkStart w:id="10" w:name="headcount-totals"/>
     <w:p>
       <w:pPr>
         <w:pStyle w:val="Heading3"/>
       </w:pPr>
       <w:r>
-        <w:t xml:space="preserve">2.2 Shared team (allocated by FTE percentage)</w:t>
-      </w:r>
-    </w:p>
-    <w:p>
-      <w:pPr>
-        <w:pStyle w:val="FirstParagraph"/>
-      </w:pPr>
-      <w:r>
-        <w:t xml:space="preserve">These 6 people are shared across multiple clients. Allocated cost = fully-loaded CTC × allocation %.</w:t>
-      </w:r>
-    </w:p>
-    <w:tbl>
-      <w:tblPr>
-        <w:tblStyle w:val="Table"/>
-        <w:tblW w:type="pct" w:w="5000"/>
-        <w:tblLayout w:type="fixed"/>
-        <w:tblLook w:firstRow="1" w:lastRow="0" w:firstColumn="0" w:lastColumn="0" w:noHBand="0" w:noVBand="0" w:val="0020"/>
-      </w:tblPr>
-      <w:tblGrid>
-        <w:gridCol w:w="293"/>
-        <w:gridCol w:w="1271"/>
-        <w:gridCol w:w="1075"/>
-        <w:gridCol w:w="2053"/>
-        <w:gridCol w:w="1368"/>
-        <w:gridCol w:w="1857"/>
-      </w:tblGrid>
-      <w:tr>
-        <w:trPr>
-          <w:tblHeader w:val="on"/>
-        </w:trPr>
-        <w:tc>
-          <w:tcPr/>
-          <w:p>
-            <w:pPr>
-              <w:pStyle w:val="Compact"/>
-            </w:pPr>
-            <w:r>
-              <w:t xml:space="preserve">#</w:t>
-            </w:r>
-          </w:p>
-        </w:tc>
-        <w:tc>
-          <w:tcPr/>
-          <w:p>
-            <w:pPr>
-              <w:pStyle w:val="Compact"/>
-            </w:pPr>
-            <w:r>
-              <w:t xml:space="preserve">Designation</w:t>
-            </w:r>
-          </w:p>
-        </w:tc>
-        <w:tc>
-          <w:tcPr/>
-          <w:p>
-            <w:pPr>
-              <w:pStyle w:val="Compact"/>
-            </w:pPr>
-            <w:r>
-              <w:t xml:space="preserve">Headcount</w:t>
-            </w:r>
-          </w:p>
-        </w:tc>
-        <w:tc>
-          <w:tcPr/>
-          <w:p>
-            <w:pPr>
-              <w:pStyle w:val="Compact"/>
-            </w:pPr>
-            <w:r>
-              <w:t xml:space="preserve">Loaded CTC /mo (₹)</w:t>
-            </w:r>
-          </w:p>
-        </w:tc>
-        <w:tc>
-          <w:tcPr/>
-          <w:p>
-            <w:pPr>
-              <w:pStyle w:val="Compact"/>
-            </w:pPr>
-            <w:r>
-              <w:t xml:space="preserve">Allocation %</w:t>
-            </w:r>
-          </w:p>
-        </w:tc>
-        <w:tc>
-          <w:tcPr/>
-          <w:p>
-            <w:pPr>
-              <w:pStyle w:val="Compact"/>
-            </w:pPr>
-            <w:r>
-              <w:t xml:space="preserve">Allocated /mo (₹)</w:t>
-            </w:r>
-          </w:p>
-        </w:tc>
-      </w:tr>
-      <w:tr>
-        <w:tc>
-          <w:tcPr/>
-          <w:p>
-            <w:pPr>
-              <w:pStyle w:val="Compact"/>
-            </w:pPr>
-            <w:r>
-              <w:t xml:space="preserve">6</w:t>
-            </w:r>
-          </w:p>
-        </w:tc>
-        <w:tc>
-          <w:tcPr/>
-          <w:p>
-            <w:pPr>
-              <w:pStyle w:val="Compact"/>
-            </w:pPr>
-            <w:r>
-              <w:t xml:space="preserve">Network &amp; Systems Engineer (L2)</w:t>
-            </w:r>
-          </w:p>
-        </w:tc>
-        <w:tc>
-          <w:tcPr/>
-          <w:p>
-            <w:pPr>
-              <w:pStyle w:val="Compact"/>
-            </w:pPr>
-            <w:r>
-              <w:t xml:space="preserve">1</w:t>
-            </w:r>
-          </w:p>
-        </w:tc>
-        <w:tc>
-          <w:tcPr/>
-          <w:p>
-            <w:pPr>
-              <w:pStyle w:val="Compact"/>
-            </w:pPr>
-            <w:r>
-              <w:t xml:space="preserve">1,30,000</w:t>
-            </w:r>
-          </w:p>
-        </w:tc>
-        <w:tc>
-          <w:tcPr/>
-          <w:p>
-            <w:pPr>
-              <w:pStyle w:val="Compact"/>
-            </w:pPr>
-            <w:r>
-              <w:t xml:space="preserve">70%</w:t>
-            </w:r>
-          </w:p>
-        </w:tc>
-        <w:tc>
-          <w:tcPr/>
-          <w:p>
-            <w:pPr>
-              <w:pStyle w:val="Compact"/>
-            </w:pPr>
-            <w:r>
-              <w:t xml:space="preserve">91,000</w:t>
-            </w:r>
-          </w:p>
-        </w:tc>
-      </w:tr>
-      <w:tr>
-        <w:tc>
-          <w:tcPr/>
-          <w:p>
-            <w:pPr>
-              <w:pStyle w:val="Compact"/>
-            </w:pPr>
-            <w:r>
-              <w:t xml:space="preserve">7</w:t>
-            </w:r>
-          </w:p>
-        </w:tc>
-        <w:tc>
-          <w:tcPr/>
-          <w:p>
-            <w:pPr>
-              <w:pStyle w:val="Compact"/>
-            </w:pPr>
-            <w:r>
-              <w:t xml:space="preserve">HospitalPro Application Support Engineer</w:t>
-            </w:r>
-          </w:p>
-        </w:tc>
-        <w:tc>
-          <w:tcPr/>
-          <w:p>
-            <w:pPr>
-              <w:pStyle w:val="Compact"/>
-            </w:pPr>
-            <w:r>
-              <w:t xml:space="preserve">1</w:t>
-            </w:r>
-          </w:p>
-        </w:tc>
-        <w:tc>
-          <w:tcPr/>
-          <w:p>
-            <w:pPr>
-              <w:pStyle w:val="Compact"/>
-            </w:pPr>
-            <w:r>
-              <w:t xml:space="preserve">1,40,000</w:t>
-            </w:r>
-          </w:p>
-        </w:tc>
-        <w:tc>
-          <w:tcPr/>
-          <w:p>
-            <w:pPr>
-              <w:pStyle w:val="Compact"/>
-            </w:pPr>
-            <w:r>
-              <w:t xml:space="preserve">50%</w:t>
-            </w:r>
-          </w:p>
-        </w:tc>
-        <w:tc>
-          <w:tcPr/>
-          <w:p>
-            <w:pPr>
-              <w:pStyle w:val="Compact"/>
-            </w:pPr>
-            <w:r>
-              <w:t xml:space="preserve">70,000</w:t>
-            </w:r>
-          </w:p>
-        </w:tc>
-      </w:tr>
-      <w:tr>
-        <w:tc>
-          <w:tcPr/>
-          <w:p>
-            <w:pPr>
-              <w:pStyle w:val="Compact"/>
-            </w:pPr>
-            <w:r>
-              <w:t xml:space="preserve">8</w:t>
-            </w:r>
-          </w:p>
-        </w:tc>
-        <w:tc>
-          <w:tcPr/>
-          <w:p>
-            <w:pPr>
-              <w:pStyle w:val="Compact"/>
-            </w:pPr>
-            <w:r>
-              <w:t xml:space="preserve">Security Analyst (24×7 SOC)</w:t>
-            </w:r>
-          </w:p>
-        </w:tc>
-        <w:tc>
-          <w:tcPr/>
-          <w:p>
-            <w:pPr>
-              <w:pStyle w:val="Compact"/>
-            </w:pPr>
-            <w:r>
-              <w:t xml:space="preserve">1</w:t>
-            </w:r>
-          </w:p>
-        </w:tc>
-        <w:tc>
-          <w:tcPr/>
-          <w:p>
-            <w:pPr>
-              <w:pStyle w:val="Compact"/>
-            </w:pPr>
-            <w:r>
-              <w:t xml:space="preserve">1,40,000</w:t>
-            </w:r>
-          </w:p>
-        </w:tc>
-        <w:tc>
-          <w:tcPr/>
-          <w:p>
-            <w:pPr>
-              <w:pStyle w:val="Compact"/>
-            </w:pPr>
-            <w:r>
-              <w:t xml:space="preserve">30%</w:t>
-            </w:r>
-          </w:p>
-        </w:tc>
-        <w:tc>
-          <w:tcPr/>
-          <w:p>
-            <w:pPr>
-              <w:pStyle w:val="Compact"/>
-            </w:pPr>
-            <w:r>
-              <w:t xml:space="preserve">42,000</w:t>
-            </w:r>
-          </w:p>
-        </w:tc>
-      </w:tr>
-      <w:tr>
-        <w:tc>
-          <w:tcPr/>
-          <w:p>
-            <w:pPr>
-              <w:pStyle w:val="Compact"/>
-            </w:pPr>
-            <w:r>
-              <w:t xml:space="preserve">9</w:t>
-            </w:r>
-          </w:p>
-        </w:tc>
-        <w:tc>
-          <w:tcPr/>
-          <w:p>
-            <w:pPr>
-              <w:pStyle w:val="Compact"/>
-            </w:pPr>
-            <w:r>
-              <w:t xml:space="preserve">Account Manager / Service Delivery</w:t>
-            </w:r>
-          </w:p>
-        </w:tc>
-        <w:tc>
-          <w:tcPr/>
-          <w:p>
-            <w:pPr>
-              <w:pStyle w:val="Compact"/>
-            </w:pPr>
-            <w:r>
-              <w:t xml:space="preserve">1</w:t>
-            </w:r>
-          </w:p>
-        </w:tc>
-        <w:tc>
-          <w:tcPr/>
-          <w:p>
-            <w:pPr>
-              <w:pStyle w:val="Compact"/>
-            </w:pPr>
-            <w:r>
-              <w:t xml:space="preserve">1,40,000</w:t>
-            </w:r>
-          </w:p>
-        </w:tc>
-        <w:tc>
-          <w:tcPr/>
-          <w:p>
-            <w:pPr>
-              <w:pStyle w:val="Compact"/>
-            </w:pPr>
-            <w:r>
-              <w:t xml:space="preserve">20%</w:t>
-            </w:r>
-          </w:p>
-        </w:tc>
-        <w:tc>
-          <w:tcPr/>
-          <w:p>
-            <w:pPr>
-              <w:pStyle w:val="Compact"/>
-            </w:pPr>
-            <w:r>
-              <w:t xml:space="preserve">28,000</w:t>
-            </w:r>
-          </w:p>
-        </w:tc>
-      </w:tr>
-      <w:tr>
-        <w:tc>
-          <w:tcPr/>
-          <w:p>
-            <w:pPr>
-              <w:pStyle w:val="Compact"/>
-            </w:pPr>
-            <w:r>
-              <w:t xml:space="preserve">10</w:t>
-            </w:r>
-          </w:p>
-        </w:tc>
-        <w:tc>
-          <w:tcPr/>
-          <w:p>
-            <w:pPr>
-              <w:pStyle w:val="Compact"/>
-            </w:pPr>
-            <w:r>
-              <w:t xml:space="preserve">Engineering Lead (L3/L4 escalation)</w:t>
-            </w:r>
-          </w:p>
-        </w:tc>
-        <w:tc>
-          <w:tcPr/>
-          <w:p>
-            <w:pPr>
-              <w:pStyle w:val="Compact"/>
-            </w:pPr>
-            <w:r>
-              <w:t xml:space="preserve">1</w:t>
-            </w:r>
-          </w:p>
-        </w:tc>
-        <w:tc>
-          <w:tcPr/>
-          <w:p>
-            <w:pPr>
-              <w:pStyle w:val="Compact"/>
-            </w:pPr>
-            <w:r>
-              <w:t xml:space="preserve">1,50,000</w:t>
-            </w:r>
-          </w:p>
-        </w:tc>
-        <w:tc>
-          <w:tcPr/>
-          <w:p>
-            <w:pPr>
-              <w:pStyle w:val="Compact"/>
-            </w:pPr>
-            <w:r>
-              <w:t xml:space="preserve">10%</w:t>
-            </w:r>
-          </w:p>
-        </w:tc>
-        <w:tc>
-          <w:tcPr/>
-          <w:p>
-            <w:pPr>
-              <w:pStyle w:val="Compact"/>
-            </w:pPr>
-            <w:r>
-              <w:t xml:space="preserve">15,000</w:t>
-            </w:r>
-          </w:p>
-        </w:tc>
-      </w:tr>
-      <w:tr>
-        <w:tc>
-          <w:tcPr/>
-          <w:p>
-            <w:pPr>
-              <w:pStyle w:val="Compact"/>
-            </w:pPr>
-          </w:p>
-        </w:tc>
-        <w:tc>
-          <w:tcPr/>
-          <w:p>
-            <w:pPr>
-              <w:pStyle w:val="Compact"/>
-            </w:pPr>
-            <w:r>
-              <w:rPr>
-                <w:b/>
-                <w:bCs/>
-              </w:rPr>
-              <w:t xml:space="preserve">Subtotal — shared</w:t>
-            </w:r>
-          </w:p>
-        </w:tc>
-        <w:tc>
-          <w:tcPr/>
-          <w:p>
-            <w:pPr>
-              <w:pStyle w:val="Compact"/>
-            </w:pPr>
-            <w:r>
-              <w:rPr>
-                <w:b/>
-                <w:bCs/>
-              </w:rPr>
-              <w:t xml:space="preserve">6 people</w:t>
-            </w:r>
-            <w:r>
-              <w:t xml:space="preserve"> </w:t>
-            </w:r>
-            <w:r>
-              <w:t xml:space="preserve">(cumulative ~1.8 FTE)</w:t>
-            </w:r>
-          </w:p>
-        </w:tc>
-        <w:tc>
-          <w:tcPr/>
-          <w:p>
-            <w:pPr>
-              <w:pStyle w:val="Compact"/>
-            </w:pPr>
-          </w:p>
-        </w:tc>
-        <w:tc>
-          <w:tcPr/>
-          <w:p>
-            <w:pPr>
-              <w:pStyle w:val="Compact"/>
-            </w:pPr>
-          </w:p>
-        </w:tc>
-        <w:tc>
-          <w:tcPr/>
-          <w:p>
-            <w:pPr>
-              <w:pStyle w:val="Compact"/>
-            </w:pPr>
-            <w:r>
-              <w:rPr>
-                <w:b/>
-                <w:bCs/>
-              </w:rPr>
-              <w:t xml:space="preserve">₹2,46,000</w:t>
-            </w:r>
-          </w:p>
-        </w:tc>
-      </w:tr>
-    </w:tbl>
-    <w:bookmarkEnd w:id="11"/>
-    <w:bookmarkStart w:id="12" w:name="headcount-totals"/>
-    <w:p>
-      <w:pPr>
-        <w:pStyle w:val="Heading3"/>
-      </w:pPr>
-      <w:r>
-        <w:t xml:space="preserve">2.3 Headcount totals</w:t>
+        <w:t xml:space="preserve">2.1 Headcount totals</w:t>
       </w:r>
     </w:p>
     <w:tbl>
@@ -1666,7 +1419,7 @@
               <w:pStyle w:val="Compact"/>
             </w:pPr>
             <w:r>
-              <w:t xml:space="preserve">Unique bodies on this account</w:t>
+              <w:t xml:space="preserve">Total dedicated bodies on this account</w:t>
             </w:r>
           </w:p>
         </w:tc>
@@ -1681,7 +1434,7 @@
                 <w:b/>
                 <w:bCs/>
               </w:rPr>
-              <w:t xml:space="preserve">11 people</w:t>
+              <w:t xml:space="preserve">10 people</w:t>
             </w:r>
           </w:p>
         </w:tc>
@@ -1709,20 +1462,20 @@
                 <w:b/>
                 <w:bCs/>
               </w:rPr>
-              <w:t xml:space="preserve">~7.3</w:t>
-            </w:r>
-          </w:p>
-        </w:tc>
-      </w:tr>
-      <w:tr>
-        <w:tc>
-          <w:tcPr/>
-          <w:p>
-            <w:pPr>
-              <w:pStyle w:val="Compact"/>
-            </w:pPr>
-            <w:r>
-              <w:t xml:space="preserve">Total allocated salary /month</w:t>
+              <w:t xml:space="preserve">10.0</w:t>
+            </w:r>
+          </w:p>
+        </w:tc>
+      </w:tr>
+      <w:tr>
+        <w:tc>
+          <w:tcPr/>
+          <w:p>
+            <w:pPr>
+              <w:pStyle w:val="Compact"/>
+            </w:pPr>
+            <w:r>
+              <w:t xml:space="preserve">Total loaded salary cost /month</w:t>
             </w:r>
           </w:p>
         </w:tc>
@@ -1737,20 +1490,28 @@
                 <w:b/>
                 <w:bCs/>
               </w:rPr>
-              <w:t xml:space="preserve">₹6,18,000</w:t>
+              <w:t xml:space="preserve">₹11,95,000</w:t>
             </w:r>
           </w:p>
         </w:tc>
       </w:tr>
     </w:tbl>
-    <w:bookmarkEnd w:id="12"/>
-    <w:bookmarkStart w:id="13" w:name="coverage-windows"/>
+    <w:bookmarkEnd w:id="10"/>
+    <w:bookmarkStart w:id="11" w:name="coverage-windows"/>
     <w:p>
       <w:pPr>
         <w:pStyle w:val="Heading3"/>
       </w:pPr>
       <w:r>
-        <w:t xml:space="preserve">2.4 Coverage windows</w:t>
+        <w:t xml:space="preserve">2.2 Coverage windows</w:t>
+      </w:r>
+    </w:p>
+    <w:p>
+      <w:pPr>
+        <w:pStyle w:val="FirstParagraph"/>
+      </w:pPr>
+      <w:r>
+        <w:t xml:space="preserve">Because every role is dedicated, the hospital gets significantly broader coverage than a shared model. The full team is reachable during business hours; on-call rotations cover nights and weekends.</w:t>
       </w:r>
     </w:p>
     <w:tbl>
@@ -1761,11 +1522,12 @@
         <w:tblLook w:firstRow="1" w:lastRow="0" w:firstColumn="0" w:lastColumn="0" w:noHBand="0" w:noVBand="0" w:val="0020"/>
       </w:tblPr>
       <w:tblGrid>
-        <w:gridCol w:w="1716"/>
-        <w:gridCol w:w="1452"/>
-        <w:gridCol w:w="1848"/>
-        <w:gridCol w:w="1848"/>
-        <w:gridCol w:w="1056"/>
+        <w:gridCol w:w="1040"/>
+        <w:gridCol w:w="880"/>
+        <w:gridCol w:w="1520"/>
+        <w:gridCol w:w="1920"/>
+        <w:gridCol w:w="1120"/>
+        <w:gridCol w:w="1440"/>
       </w:tblGrid>
       <w:tr>
         <w:trPr>
@@ -1800,7 +1562,18 @@
               <w:pStyle w:val="Compact"/>
             </w:pPr>
             <w:r>
-              <w:t xml:space="preserve">Remote L2/L3</w:t>
+              <w:t xml:space="preserve">DevOps + Network</w:t>
+            </w:r>
+          </w:p>
+        </w:tc>
+        <w:tc>
+          <w:tcPr/>
+          <w:p>
+            <w:pPr>
+              <w:pStyle w:val="Compact"/>
+            </w:pPr>
+            <w:r>
+              <w:t xml:space="preserve">App Support + Security</w:t>
             </w:r>
           </w:p>
         </w:tc>
@@ -1822,7 +1595,7 @@
               <w:pStyle w:val="Compact"/>
             </w:pPr>
             <w:r>
-              <w:t xml:space="preserve">DevOps</w:t>
+              <w:t xml:space="preserve">Engineering Lead</w:t>
             </w:r>
           </w:p>
         </w:tc>
@@ -1846,7 +1619,7 @@
               <w:pStyle w:val="Compact"/>
             </w:pPr>
             <w:r>
-              <w:t xml:space="preserve">✅ 2 in shifts</w:t>
+              <w:t xml:space="preserve">✅ 2 in shifts + 1 rotation</w:t>
             </w:r>
           </w:p>
         </w:tc>
@@ -1868,6 +1641,17 @@
               <w:pStyle w:val="Compact"/>
             </w:pPr>
             <w:r>
+              <w:t xml:space="preserve">✅ Available</w:t>
+            </w:r>
+          </w:p>
+        </w:tc>
+        <w:tc>
+          <w:tcPr/>
+          <w:p>
+            <w:pPr>
+              <w:pStyle w:val="Compact"/>
+            </w:pPr>
+            <w:r>
               <w:t xml:space="preserve">✅ Mon–Sat 9–6</w:t>
             </w:r>
           </w:p>
@@ -1903,18 +1687,29 @@
               <w:pStyle w:val="Compact"/>
             </w:pPr>
             <w:r>
-              <w:t xml:space="preserve">On-call, 1-hr ETA</w:t>
-            </w:r>
-          </w:p>
-        </w:tc>
-        <w:tc>
-          <w:tcPr/>
-          <w:p>
-            <w:pPr>
-              <w:pStyle w:val="Compact"/>
-            </w:pPr>
-            <w:r>
-              <w:t xml:space="preserve">✅ 24×7 SOC</w:t>
+              <w:t xml:space="preserve">On-call, 1-hour onsite ETA</w:t>
+            </w:r>
+          </w:p>
+        </w:tc>
+        <w:tc>
+          <w:tcPr/>
+          <w:p>
+            <w:pPr>
+              <w:pStyle w:val="Compact"/>
+            </w:pPr>
+            <w:r>
+              <w:t xml:space="preserve">On-call</w:t>
+            </w:r>
+          </w:p>
+        </w:tc>
+        <w:tc>
+          <w:tcPr/>
+          <w:p>
+            <w:pPr>
+              <w:pStyle w:val="Compact"/>
+            </w:pPr>
+            <w:r>
+              <w:t xml:space="preserve">On-call</w:t>
             </w:r>
           </w:p>
         </w:tc>
@@ -1960,18 +1755,29 @@
               <w:pStyle w:val="Compact"/>
             </w:pPr>
             <w:r>
-              <w:t xml:space="preserve">On-call, 1-hr ETA</w:t>
-            </w:r>
-          </w:p>
-        </w:tc>
-        <w:tc>
-          <w:tcPr/>
-          <w:p>
-            <w:pPr>
-              <w:pStyle w:val="Compact"/>
-            </w:pPr>
-            <w:r>
-              <w:t xml:space="preserve">✅ Available</w:t>
+              <w:t xml:space="preserve">On-call, 1-hour onsite ETA</w:t>
+            </w:r>
+          </w:p>
+        </w:tc>
+        <w:tc>
+          <w:tcPr/>
+          <w:p>
+            <w:pPr>
+              <w:pStyle w:val="Compact"/>
+            </w:pPr>
+            <w:r>
+              <w:t xml:space="preserve">On-call</w:t>
+            </w:r>
+          </w:p>
+        </w:tc>
+        <w:tc>
+          <w:tcPr/>
+          <w:p>
+            <w:pPr>
+              <w:pStyle w:val="Compact"/>
+            </w:pPr>
+            <w:r>
+              <w:t xml:space="preserve">On-call</w:t>
             </w:r>
           </w:p>
         </w:tc>
@@ -2017,18 +1823,29 @@
               <w:pStyle w:val="Compact"/>
             </w:pPr>
             <w:r>
-              <w:t xml:space="preserve">On-call, 1-hr ETA</w:t>
-            </w:r>
-          </w:p>
-        </w:tc>
-        <w:tc>
-          <w:tcPr/>
-          <w:p>
-            <w:pPr>
-              <w:pStyle w:val="Compact"/>
-            </w:pPr>
-            <w:r>
-              <w:t xml:space="preserve">✅ Available</w:t>
+              <w:t xml:space="preserve">On-call, 1-hour onsite ETA</w:t>
+            </w:r>
+          </w:p>
+        </w:tc>
+        <w:tc>
+          <w:tcPr/>
+          <w:p>
+            <w:pPr>
+              <w:pStyle w:val="Compact"/>
+            </w:pPr>
+            <w:r>
+              <w:t xml:space="preserve">On-call</w:t>
+            </w:r>
+          </w:p>
+        </w:tc>
+        <w:tc>
+          <w:tcPr/>
+          <w:p>
+            <w:pPr>
+              <w:pStyle w:val="Compact"/>
+            </w:pPr>
+            <w:r>
+              <w:t xml:space="preserve">On-call</w:t>
             </w:r>
           </w:p>
         </w:tc>
@@ -2063,9 +1880,9 @@
         </w:pict>
       </w:r>
     </w:p>
-    <w:bookmarkEnd w:id="13"/>
-    <w:bookmarkEnd w:id="14"/>
-    <w:bookmarkStart w:id="23" w:name="key-result-areas-kras-by-role"/>
+    <w:bookmarkEnd w:id="11"/>
+    <w:bookmarkEnd w:id="12"/>
+    <w:bookmarkStart w:id="21" w:name="key-result-areas-kras-by-role"/>
     <w:p>
       <w:pPr>
         <w:pStyle w:val="Heading2"/>
@@ -2082,7 +1899,7 @@
         <w:t xml:space="preserve">KRAs are measurable outcomes used to evaluate each role’s performance. They feed directly into the SLA matrix the client sees and the internal monthly performance review.</w:t>
       </w:r>
     </w:p>
-    <w:bookmarkStart w:id="15" w:name="it-site-manager-spoc"/>
+    <w:bookmarkStart w:id="13" w:name="it-site-manager-spoc"/>
     <w:p>
       <w:pPr>
         <w:pStyle w:val="Heading3"/>
@@ -2422,14 +2239,14 @@
         </w:tc>
       </w:tr>
     </w:tbl>
-    <w:bookmarkEnd w:id="15"/>
-    <w:bookmarkStart w:id="16" w:name="l1-helpdesk-engineer-2.5-fte"/>
+    <w:bookmarkEnd w:id="13"/>
+    <w:bookmarkStart w:id="14" w:name="l1-helpdesk-engineer-3-dedicated"/>
     <w:p>
       <w:pPr>
         <w:pStyle w:val="Heading3"/>
       </w:pPr>
       <w:r>
-        <w:t xml:space="preserve">3.2 L1 Helpdesk Engineer (× 2.5 FTE)</w:t>
+        <w:t xml:space="preserve">3.2 L1 Helpdesk Engineer (× 3 dedicated)</w:t>
       </w:r>
     </w:p>
     <w:tbl>
@@ -2763,14 +2580,14 @@
         </w:tc>
       </w:tr>
     </w:tbl>
-    <w:bookmarkEnd w:id="16"/>
-    <w:bookmarkStart w:id="17" w:name="cloud-devops-engineer-dedicated"/>
+    <w:bookmarkEnd w:id="14"/>
+    <w:bookmarkStart w:id="15" w:name="cloud-devops-engineer"/>
     <w:p>
       <w:pPr>
         <w:pStyle w:val="Heading3"/>
       </w:pPr>
       <w:r>
-        <w:t xml:space="preserve">3.3 Cloud / DevOps Engineer (dedicated)</w:t>
+        <w:t xml:space="preserve">3.3 Cloud / DevOps Engineer</w:t>
       </w:r>
     </w:p>
     <w:tbl>
@@ -3178,8 +2995,8 @@
         </w:tc>
       </w:tr>
     </w:tbl>
-    <w:bookmarkEnd w:id="17"/>
-    <w:bookmarkStart w:id="18" w:name="network-systems-engineer-l2"/>
+    <w:bookmarkEnd w:id="15"/>
+    <w:bookmarkStart w:id="16" w:name="network-systems-engineer-l2"/>
     <w:p>
       <w:pPr>
         <w:pStyle w:val="Heading3"/>
@@ -3519,8 +3336,8 @@
         </w:tc>
       </w:tr>
     </w:tbl>
-    <w:bookmarkEnd w:id="18"/>
-    <w:bookmarkStart w:id="19" w:name="hospitalpro-application-support-engineer"/>
+    <w:bookmarkEnd w:id="16"/>
+    <w:bookmarkStart w:id="17" w:name="hospitalpro-application-support-engineer"/>
     <w:p>
       <w:pPr>
         <w:pStyle w:val="Heading3"/>
@@ -3864,14 +3681,14 @@
         </w:tc>
       </w:tr>
     </w:tbl>
-    <w:bookmarkEnd w:id="19"/>
-    <w:bookmarkStart w:id="20" w:name="security-analyst-soc"/>
+    <w:bookmarkEnd w:id="17"/>
+    <w:bookmarkStart w:id="18" w:name="security-analyst"/>
     <w:p>
       <w:pPr>
         <w:pStyle w:val="Heading3"/>
       </w:pPr>
       <w:r>
-        <w:t xml:space="preserve">3.6 Security Analyst (SOC)</w:t>
+        <w:t xml:space="preserve">3.6 Security Analyst</w:t>
       </w:r>
     </w:p>
     <w:tbl>
@@ -4209,8 +4026,8 @@
         </w:tc>
       </w:tr>
     </w:tbl>
-    <w:bookmarkEnd w:id="20"/>
-    <w:bookmarkStart w:id="21" w:name="account-manager-service-delivery"/>
+    <w:bookmarkEnd w:id="18"/>
+    <w:bookmarkStart w:id="19" w:name="account-manager-service-delivery"/>
     <w:p>
       <w:pPr>
         <w:pStyle w:val="Heading3"/>
@@ -4288,7 +4105,7 @@
               <w:pStyle w:val="Compact"/>
             </w:pPr>
             <w:r>
-              <w:t xml:space="preserve">≥ 4.0 / 5 quarterly</w:t>
+              <w:t xml:space="preserve">≥ 4.2 / 5 quarterly</w:t>
             </w:r>
           </w:p>
         </w:tc>
@@ -4554,8 +4371,8 @@
         </w:tc>
       </w:tr>
     </w:tbl>
-    <w:bookmarkEnd w:id="21"/>
-    <w:bookmarkStart w:id="22" w:name="engineering-lead-l3l4-escalation"/>
+    <w:bookmarkEnd w:id="19"/>
+    <w:bookmarkStart w:id="20" w:name="engineering-lead-l3l4-escalation"/>
     <w:p>
       <w:pPr>
         <w:pStyle w:val="Heading3"/>
@@ -4801,7 +4618,7 @@
               <w:pStyle w:val="Compact"/>
             </w:pPr>
             <w:r>
-              <w:t xml:space="preserve">Cross-client knowledge sharing</w:t>
+              <w:t xml:space="preserve">Cross-team knowledge sharing</w:t>
             </w:r>
           </w:p>
         </w:tc>
@@ -4871,15 +4688,23 @@
         </w:pict>
       </w:r>
     </w:p>
-    <w:bookmarkEnd w:id="22"/>
-    <w:bookmarkEnd w:id="23"/>
-    <w:bookmarkStart w:id="24" w:name="cost-build-up"/>
+    <w:bookmarkEnd w:id="20"/>
+    <w:bookmarkEnd w:id="21"/>
+    <w:bookmarkStart w:id="22" w:name="cost-build-up"/>
     <w:p>
       <w:pPr>
         <w:pStyle w:val="Heading2"/>
       </w:pPr>
       <w:r>
         <w:t xml:space="preserve">4. Cost build-up</w:t>
+      </w:r>
+    </w:p>
+    <w:p>
+      <w:pPr>
+        <w:pStyle w:val="FirstParagraph"/>
+      </w:pPr>
+      <w:r>
+        <w:t xml:space="preserve">All resources are dedicated and 100% allocated. Costs are linear (no FTE fractions).</w:t>
       </w:r>
     </w:p>
     <w:tbl>
@@ -4932,7 +4757,7 @@
                 <w:b/>
                 <w:bCs/>
               </w:rPr>
-              <w:t xml:space="preserve">Dedicated team (5 people, 100% allocated)</w:t>
+              <w:t xml:space="preserve">Dedicated team (10 people, 100% allocated)</w:t>
             </w:r>
           </w:p>
         </w:tc>
@@ -4977,31 +4802,31 @@
               <w:pStyle w:val="Compact"/>
             </w:pPr>
             <w:r>
-              <w:t xml:space="preserve">L1 Helpdesk × 2.5 FTE (avg)</w:t>
-            </w:r>
-          </w:p>
-        </w:tc>
-        <w:tc>
-          <w:tcPr/>
-          <w:p>
-            <w:pPr>
-              <w:pStyle w:val="Compact"/>
-            </w:pPr>
-            <w:r>
-              <w:t xml:space="preserve">1,15,000</w:t>
-            </w:r>
-          </w:p>
-        </w:tc>
-      </w:tr>
-      <w:tr>
-        <w:tc>
-          <w:tcPr/>
-          <w:p>
-            <w:pPr>
-              <w:pStyle w:val="Compact"/>
-            </w:pPr>
-            <w:r>
-              <w:t xml:space="preserve">Cloud / DevOps Engineer (dedicated)</w:t>
+              <w:t xml:space="preserve">L1 Helpdesk × 3 dedicated</w:t>
+            </w:r>
+          </w:p>
+        </w:tc>
+        <w:tc>
+          <w:tcPr/>
+          <w:p>
+            <w:pPr>
+              <w:pStyle w:val="Compact"/>
+            </w:pPr>
+            <w:r>
+              <w:t xml:space="preserve">1,38,000</w:t>
+            </w:r>
+          </w:p>
+        </w:tc>
+      </w:tr>
+      <w:tr>
+        <w:tc>
+          <w:tcPr/>
+          <w:p>
+            <w:pPr>
+              <w:pStyle w:val="Compact"/>
+            </w:pPr>
+            <w:r>
+              <w:t xml:space="preserve">Cloud / DevOps Engineer</w:t>
             </w:r>
           </w:p>
         </w:tc>
@@ -5025,195 +4850,114 @@
               <w:pStyle w:val="Compact"/>
             </w:pPr>
             <w:r>
-              <w:t xml:space="preserve">Subtotal — dedicated</w:t>
-            </w:r>
-          </w:p>
-        </w:tc>
-        <w:tc>
-          <w:tcPr/>
-          <w:p>
-            <w:pPr>
-              <w:pStyle w:val="Compact"/>
-            </w:pPr>
-            <w:r>
-              <w:rPr>
-                <w:b/>
-                <w:bCs/>
-              </w:rPr>
-              <w:t xml:space="preserve">3,72,000</w:t>
-            </w:r>
-          </w:p>
-        </w:tc>
-      </w:tr>
-      <w:tr>
-        <w:tc>
-          <w:tcPr/>
-          <w:p>
-            <w:pPr>
-              <w:pStyle w:val="Compact"/>
-            </w:pPr>
-            <w:r>
-              <w:rPr>
-                <w:b/>
-                <w:bCs/>
-              </w:rPr>
-              <w:t xml:space="preserve">Shared team (6 people, allocated)</w:t>
-            </w:r>
-          </w:p>
-        </w:tc>
-        <w:tc>
-          <w:tcPr/>
-          <w:p>
-            <w:pPr>
-              <w:pStyle w:val="Compact"/>
-            </w:pPr>
-          </w:p>
-        </w:tc>
-      </w:tr>
-      <w:tr>
-        <w:tc>
-          <w:tcPr/>
-          <w:p>
-            <w:pPr>
-              <w:pStyle w:val="Compact"/>
-            </w:pPr>
-            <w:r>
-              <w:t xml:space="preserve">Network &amp; Systems Engineer (0.7 FTE)</w:t>
-            </w:r>
-          </w:p>
-        </w:tc>
-        <w:tc>
-          <w:tcPr/>
-          <w:p>
-            <w:pPr>
-              <w:pStyle w:val="Compact"/>
-            </w:pPr>
-            <w:r>
-              <w:t xml:space="preserve">91,000</w:t>
-            </w:r>
-          </w:p>
-        </w:tc>
-      </w:tr>
-      <w:tr>
-        <w:tc>
-          <w:tcPr/>
-          <w:p>
-            <w:pPr>
-              <w:pStyle w:val="Compact"/>
-            </w:pPr>
-            <w:r>
-              <w:t xml:space="preserve">HMIS Application Support (0.5 FTE)</w:t>
-            </w:r>
-          </w:p>
-        </w:tc>
-        <w:tc>
-          <w:tcPr/>
-          <w:p>
-            <w:pPr>
-              <w:pStyle w:val="Compact"/>
-            </w:pPr>
-            <w:r>
-              <w:t xml:space="preserve">70,000</w:t>
-            </w:r>
-          </w:p>
-        </w:tc>
-      </w:tr>
-      <w:tr>
-        <w:tc>
-          <w:tcPr/>
-          <w:p>
-            <w:pPr>
-              <w:pStyle w:val="Compact"/>
-            </w:pPr>
-            <w:r>
-              <w:t xml:space="preserve">Security Analyst (0.3 FTE)</w:t>
-            </w:r>
-          </w:p>
-        </w:tc>
-        <w:tc>
-          <w:tcPr/>
-          <w:p>
-            <w:pPr>
-              <w:pStyle w:val="Compact"/>
-            </w:pPr>
-            <w:r>
-              <w:t xml:space="preserve">42,000</w:t>
-            </w:r>
-          </w:p>
-        </w:tc>
-      </w:tr>
-      <w:tr>
-        <w:tc>
-          <w:tcPr/>
-          <w:p>
-            <w:pPr>
-              <w:pStyle w:val="Compact"/>
-            </w:pPr>
-            <w:r>
-              <w:t xml:space="preserve">Account Manager (0.2 FTE)</w:t>
-            </w:r>
-          </w:p>
-        </w:tc>
-        <w:tc>
-          <w:tcPr/>
-          <w:p>
-            <w:pPr>
-              <w:pStyle w:val="Compact"/>
-            </w:pPr>
-            <w:r>
-              <w:t xml:space="preserve">28,000</w:t>
-            </w:r>
-          </w:p>
-        </w:tc>
-      </w:tr>
-      <w:tr>
-        <w:tc>
-          <w:tcPr/>
-          <w:p>
-            <w:pPr>
-              <w:pStyle w:val="Compact"/>
-            </w:pPr>
-            <w:r>
-              <w:t xml:space="preserve">Engineering Lead (0.1 FTE)</w:t>
-            </w:r>
-          </w:p>
-        </w:tc>
-        <w:tc>
-          <w:tcPr/>
-          <w:p>
-            <w:pPr>
-              <w:pStyle w:val="Compact"/>
-            </w:pPr>
-            <w:r>
-              <w:t xml:space="preserve">15,000</w:t>
-            </w:r>
-          </w:p>
-        </w:tc>
-      </w:tr>
-      <w:tr>
-        <w:tc>
-          <w:tcPr/>
-          <w:p>
-            <w:pPr>
-              <w:pStyle w:val="Compact"/>
-            </w:pPr>
-            <w:r>
-              <w:t xml:space="preserve">Subtotal — shared</w:t>
-            </w:r>
-          </w:p>
-        </w:tc>
-        <w:tc>
-          <w:tcPr/>
-          <w:p>
-            <w:pPr>
-              <w:pStyle w:val="Compact"/>
-            </w:pPr>
-            <w:r>
-              <w:rPr>
-                <w:b/>
-                <w:bCs/>
-              </w:rPr>
-              <w:t xml:space="preserve">2,46,000</w:t>
+              <w:t xml:space="preserve">Network &amp; Systems Engineer (L2)</w:t>
+            </w:r>
+          </w:p>
+        </w:tc>
+        <w:tc>
+          <w:tcPr/>
+          <w:p>
+            <w:pPr>
+              <w:pStyle w:val="Compact"/>
+            </w:pPr>
+            <w:r>
+              <w:t xml:space="preserve">1,30,000</w:t>
+            </w:r>
+          </w:p>
+        </w:tc>
+      </w:tr>
+      <w:tr>
+        <w:tc>
+          <w:tcPr/>
+          <w:p>
+            <w:pPr>
+              <w:pStyle w:val="Compact"/>
+            </w:pPr>
+            <w:r>
+              <w:t xml:space="preserve">HospitalPro Application Support</w:t>
+            </w:r>
+          </w:p>
+        </w:tc>
+        <w:tc>
+          <w:tcPr/>
+          <w:p>
+            <w:pPr>
+              <w:pStyle w:val="Compact"/>
+            </w:pPr>
+            <w:r>
+              <w:t xml:space="preserve">1,40,000</w:t>
+            </w:r>
+          </w:p>
+        </w:tc>
+      </w:tr>
+      <w:tr>
+        <w:tc>
+          <w:tcPr/>
+          <w:p>
+            <w:pPr>
+              <w:pStyle w:val="Compact"/>
+            </w:pPr>
+            <w:r>
+              <w:t xml:space="preserve">Security Analyst</w:t>
+            </w:r>
+          </w:p>
+        </w:tc>
+        <w:tc>
+          <w:tcPr/>
+          <w:p>
+            <w:pPr>
+              <w:pStyle w:val="Compact"/>
+            </w:pPr>
+            <w:r>
+              <w:t xml:space="preserve">1,40,000</w:t>
+            </w:r>
+          </w:p>
+        </w:tc>
+      </w:tr>
+      <w:tr>
+        <w:tc>
+          <w:tcPr/>
+          <w:p>
+            <w:pPr>
+              <w:pStyle w:val="Compact"/>
+            </w:pPr>
+            <w:r>
+              <w:t xml:space="preserve">Account Manager</w:t>
+            </w:r>
+          </w:p>
+        </w:tc>
+        <w:tc>
+          <w:tcPr/>
+          <w:p>
+            <w:pPr>
+              <w:pStyle w:val="Compact"/>
+            </w:pPr>
+            <w:r>
+              <w:t xml:space="preserve">1,40,000</w:t>
+            </w:r>
+          </w:p>
+        </w:tc>
+      </w:tr>
+      <w:tr>
+        <w:tc>
+          <w:tcPr/>
+          <w:p>
+            <w:pPr>
+              <w:pStyle w:val="Compact"/>
+            </w:pPr>
+            <w:r>
+              <w:t xml:space="preserve">Engineering Lead</w:t>
+            </w:r>
+          </w:p>
+        </w:tc>
+        <w:tc>
+          <w:tcPr/>
+          <w:p>
+            <w:pPr>
+              <w:pStyle w:val="Compact"/>
+            </w:pPr>
+            <w:r>
+              <w:t xml:space="preserve">1,50,000</w:t>
             </w:r>
           </w:p>
         </w:tc>
@@ -5245,7 +4989,7 @@
                 <w:b/>
                 <w:bCs/>
               </w:rPr>
-              <w:t xml:space="preserve">6,18,000</w:t>
+              <w:t xml:space="preserve">11,95,000</w:t>
             </w:r>
           </w:p>
         </w:tc>
@@ -5349,7 +5093,7 @@
                 <w:b/>
                 <w:bCs/>
               </w:rPr>
-              <w:t xml:space="preserve">7,67,000</w:t>
+              <w:t xml:space="preserve">13,44,000</w:t>
             </w:r>
           </w:p>
         </w:tc>
@@ -5373,7 +5117,7 @@
               <w:pStyle w:val="Compact"/>
             </w:pPr>
             <w:r>
-              <w:t xml:space="preserve">3,23,000</w:t>
+              <w:t xml:space="preserve">5,66,000</w:t>
             </w:r>
           </w:p>
         </w:tc>
@@ -5405,7 +5149,7 @@
                 <w:b/>
                 <w:bCs/>
               </w:rPr>
-              <w:t xml:space="preserve">₹10,90,000</w:t>
+              <w:t xml:space="preserve">₹19,10,000</w:t>
             </w:r>
           </w:p>
         </w:tc>
@@ -5429,7 +5173,7 @@
               <w:pStyle w:val="Compact"/>
             </w:pPr>
             <w:r>
-              <w:t xml:space="preserve">₹1,96,200</w:t>
+              <w:t xml:space="preserve">₹3,43,800</w:t>
             </w:r>
           </w:p>
         </w:tc>
@@ -5461,7 +5205,7 @@
                 <w:b/>
                 <w:bCs/>
               </w:rPr>
-              <w:t xml:space="preserve">₹12,86,200</w:t>
+              <w:t xml:space="preserve">₹22,53,800</w:t>
             </w:r>
           </w:p>
         </w:tc>
@@ -5517,7 +5261,7 @@
                 <w:b/>
                 <w:bCs/>
               </w:rPr>
-              <w:t xml:space="preserve">~₹16,87,000</w:t>
+              <w:t xml:space="preserve">~₹26,55,000</w:t>
             </w:r>
           </w:p>
         </w:tc>
@@ -5549,7 +5293,7 @@
                 <w:b/>
                 <w:bCs/>
               </w:rPr>
-              <w:t xml:space="preserve">~₹2,02,44,000</w:t>
+              <w:t xml:space="preserve">~₹3,18,60,000</w:t>
             </w:r>
           </w:p>
         </w:tc>
@@ -5562,14 +5306,171 @@
         </w:pict>
       </w:r>
     </w:p>
-    <w:bookmarkEnd w:id="24"/>
-    <w:bookmarkStart w:id="25" w:name="sign-off"/>
+    <w:bookmarkEnd w:id="22"/>
+    <w:bookmarkStart w:id="23" w:name="Xc19b20ddd715ecd7e16a8a94749de19f42d31fa"/>
     <w:p>
       <w:pPr>
         <w:pStyle w:val="Heading2"/>
       </w:pPr>
       <w:r>
-        <w:t xml:space="preserve">5. Sign-off</w:t>
+        <w:t xml:space="preserve">5. What this dedicated-team model gives the hospital</w:t>
+      </w:r>
+    </w:p>
+    <w:p>
+      <w:pPr>
+        <w:pStyle w:val="FirstParagraph"/>
+      </w:pPr>
+      <w:r>
+        <w:t xml:space="preserve">Compared to the previous shared-resource model (v1.1), the all-dedicated structure delivers:</w:t>
+      </w:r>
+    </w:p>
+    <w:p>
+      <w:pPr>
+        <w:pStyle w:val="Compact"/>
+        <w:numPr>
+          <w:ilvl w:val="0"/>
+          <w:numId w:val="1001"/>
+        </w:numPr>
+      </w:pPr>
+      <w:r>
+        <w:rPr>
+          <w:b/>
+          <w:bCs/>
+        </w:rPr>
+        <w:t xml:space="preserve">Faster SLAs.</w:t>
+      </w:r>
+      <w:r>
+        <w:t xml:space="preserve"> </w:t>
+      </w:r>
+      <w:r>
+        <w:t xml:space="preserve">Engineering Lead, Security Analyst, and Application Support are no longer waiting in another client’s queue. P1 events get immediate full-team attention.</w:t>
+      </w:r>
+    </w:p>
+    <w:p>
+      <w:pPr>
+        <w:pStyle w:val="Compact"/>
+        <w:numPr>
+          <w:ilvl w:val="0"/>
+          <w:numId w:val="1001"/>
+        </w:numPr>
+      </w:pPr>
+      <w:r>
+        <w:rPr>
+          <w:b/>
+          <w:bCs/>
+        </w:rPr>
+        <w:t xml:space="preserve">Hospital-specific expertise.</w:t>
+      </w:r>
+      <w:r>
+        <w:t xml:space="preserve"> </w:t>
+      </w:r>
+      <w:r>
+        <w:t xml:space="preserve">Every team member becomes deeply familiar with the hospital’s HMIS workflows, network topology, biometric devices, and clinical-shift patterns.</w:t>
+      </w:r>
+    </w:p>
+    <w:p>
+      <w:pPr>
+        <w:pStyle w:val="Compact"/>
+        <w:numPr>
+          <w:ilvl w:val="0"/>
+          <w:numId w:val="1001"/>
+        </w:numPr>
+      </w:pPr>
+      <w:r>
+        <w:rPr>
+          <w:b/>
+          <w:bCs/>
+        </w:rPr>
+        <w:t xml:space="preserve">Consistency for end-users.</w:t>
+      </w:r>
+      <w:r>
+        <w:t xml:space="preserve"> </w:t>
+      </w:r>
+      <w:r>
+        <w:t xml:space="preserve">Doctors and nurses see the same engineers every day, reducing repeat explanation cycles.</w:t>
+      </w:r>
+    </w:p>
+    <w:p>
+      <w:pPr>
+        <w:pStyle w:val="Compact"/>
+        <w:numPr>
+          <w:ilvl w:val="0"/>
+          <w:numId w:val="1001"/>
+        </w:numPr>
+      </w:pPr>
+      <w:r>
+        <w:rPr>
+          <w:b/>
+          <w:bCs/>
+        </w:rPr>
+        <w:t xml:space="preserve">No priority conflicts.</w:t>
+      </w:r>
+      <w:r>
+        <w:t xml:space="preserve"> </w:t>
+      </w:r>
+      <w:r>
+        <w:t xml:space="preserve">During a critical clinical incident, no team member is being pulled by another client’s outage.</w:t>
+      </w:r>
+    </w:p>
+    <w:p>
+      <w:pPr>
+        <w:pStyle w:val="Compact"/>
+        <w:numPr>
+          <w:ilvl w:val="0"/>
+          <w:numId w:val="1001"/>
+        </w:numPr>
+      </w:pPr>
+      <w:r>
+        <w:rPr>
+          <w:b/>
+          <w:bCs/>
+        </w:rPr>
+        <w:t xml:space="preserve">Stronger attrition resilience.</w:t>
+      </w:r>
+      <w:r>
+        <w:t xml:space="preserve"> </w:t>
+      </w:r>
+      <w:r>
+        <w:t xml:space="preserve">A team of 10 dedicated engineers can absorb leave, illness, and resignations more gracefully than a thin allocation across many shared resources.</w:t>
+      </w:r>
+    </w:p>
+    <w:p>
+      <w:pPr>
+        <w:pStyle w:val="Compact"/>
+        <w:numPr>
+          <w:ilvl w:val="0"/>
+          <w:numId w:val="1001"/>
+        </w:numPr>
+      </w:pPr>
+      <w:r>
+        <w:rPr>
+          <w:b/>
+          <w:bCs/>
+        </w:rPr>
+        <w:t xml:space="preserve">Cleaner audit trail.</w:t>
+      </w:r>
+      <w:r>
+        <w:t xml:space="preserve"> </w:t>
+      </w:r>
+      <w:r>
+        <w:t xml:space="preserve">Every action is attributable to a single client’s team — important for NABH and DPDP compliance reviews.</w:t>
+      </w:r>
+    </w:p>
+    <w:p>
+      <w:r>
+        <w:pict>
+          <v:rect style="width:0;height:1.5pt" o:hralign="center" o:hrstd="t" o:hr="t"/>
+        </w:pict>
+      </w:r>
+    </w:p>
+    <w:bookmarkEnd w:id="23"/>
+    <w:bookmarkStart w:id="24" w:name="sign-off"/>
+    <w:p>
+      <w:pPr>
+        <w:pStyle w:val="Heading2"/>
+      </w:pPr>
+      <w:r>
+        <w:t xml:space="preserve">6. Sign-off</w:t>
       </w:r>
     </w:p>
     <w:tbl>
@@ -5723,11 +5624,11 @@
           <w:i/>
           <w:iCs/>
         </w:rPr>
-        <w:t xml:space="preserve">This document is a companion to the full Managed IT Services Proposal. Refer to that document for scope, SLA matrix, contract terms, transition roadmap, RACI matrix, and pass-through invoicing format.</w:t>
+        <w:t xml:space="preserve">This document is a companion to the full Managed IT Services Proposal. Refer to that document for scope, SLA matrix, contract terms, transition roadmap, RACI matrix, and pass-through invoicing format. Pricing in this v1.2 supersedes the v1.1 figures in the parent proposal — the hospital should be quoted ₹19.10 lakh / month managed-services fee under the all-dedicated model.</w:t>
       </w:r>
     </w:p>
+    <w:bookmarkEnd w:id="24"/>
     <w:bookmarkEnd w:id="25"/>
-    <w:bookmarkEnd w:id="26"/>
     <w:sectPr>
       <w:footnotePr>
         <w:numRestart w:val="eachSect"/>
@@ -5838,8 +5739,114 @@
       </w:pPr>
     </w:lvl>
   </w:abstractNum>
+  <w:abstractNum w:abstractNumId="991">
+    <w:nsid w:val="0000A991"/>
+    <w:multiLevelType w:val="multilevel"/>
+    <w:lvl w:ilvl="0">
+      <w:numFmt w:val="bullet"/>
+      <w:lvlText w:val=""/>
+      <w:lvlJc w:val="left"/>
+      <w:pPr>
+        <w:ind w:left="720" w:hanging="360"/>
+      </w:pPr>
+      <w:rPr>
+        <w:rFonts w:ascii="Symbol" w:hAnsi="Symbol" w:cs="Symbol" w:hint="default"/>
+      </w:rPr>
+    </w:lvl>
+    <w:lvl w:ilvl="1">
+      <w:numFmt w:val="bullet"/>
+      <w:lvlText w:val="o"/>
+      <w:lvlJc w:val="left"/>
+      <w:pPr>
+        <w:ind w:left="1440" w:hanging="360"/>
+      </w:pPr>
+      <w:rPr>
+        <w:rFonts w:ascii="Courier New" w:hAnsi="Courier New" w:cs="Courier New" w:hint="default"/>
+      </w:rPr>
+    </w:lvl>
+    <w:lvl w:ilvl="2">
+      <w:numFmt w:val="bullet"/>
+      <w:lvlText w:val=""/>
+      <w:lvlJc w:val="left"/>
+      <w:pPr>
+        <w:ind w:left="2160" w:hanging="360"/>
+      </w:pPr>
+      <w:rPr>
+        <w:rFonts w:ascii="Wingdings" w:hAnsi="Wingdings" w:cs="Wingdings" w:hint="default"/>
+      </w:rPr>
+    </w:lvl>
+    <w:lvl w:ilvl="3">
+      <w:numFmt w:val="bullet"/>
+      <w:lvlText w:val=""/>
+      <w:lvlJc w:val="left"/>
+      <w:pPr>
+        <w:ind w:left="2880" w:hanging="360"/>
+      </w:pPr>
+      <w:rPr>
+        <w:rFonts w:ascii="Symbol" w:hAnsi="Symbol" w:cs="Symbol" w:hint="default"/>
+      </w:rPr>
+    </w:lvl>
+    <w:lvl w:ilvl="4">
+      <w:numFmt w:val="bullet"/>
+      <w:lvlText w:val="o"/>
+      <w:lvlJc w:val="left"/>
+      <w:pPr>
+        <w:ind w:left="3600" w:hanging="360"/>
+      </w:pPr>
+      <w:rPr>
+        <w:rFonts w:ascii="Courier New" w:hAnsi="Courier New" w:cs="Courier New" w:hint="default"/>
+      </w:rPr>
+    </w:lvl>
+    <w:lvl w:ilvl="5">
+      <w:numFmt w:val="bullet"/>
+      <w:lvlText w:val=""/>
+      <w:lvlJc w:val="left"/>
+      <w:pPr>
+        <w:ind w:left="4320" w:hanging="360"/>
+      </w:pPr>
+      <w:rPr>
+        <w:rFonts w:ascii="Wingdings" w:hAnsi="Wingdings" w:cs="Wingdings" w:hint="default"/>
+      </w:rPr>
+    </w:lvl>
+    <w:lvl w:ilvl="6">
+      <w:numFmt w:val="bullet"/>
+      <w:lvlText w:val=""/>
+      <w:lvlJc w:val="left"/>
+      <w:pPr>
+        <w:ind w:left="5040" w:hanging="360"/>
+      </w:pPr>
+      <w:rPr>
+        <w:rFonts w:ascii="Symbol" w:hAnsi="Symbol" w:cs="Symbol" w:hint="default"/>
+      </w:rPr>
+    </w:lvl>
+    <w:lvl w:ilvl="7">
+      <w:numFmt w:val="bullet"/>
+      <w:lvlText w:val="o"/>
+      <w:lvlJc w:val="left"/>
+      <w:pPr>
+        <w:ind w:left="5760" w:hanging="360"/>
+      </w:pPr>
+      <w:rPr>
+        <w:rFonts w:ascii="Courier New" w:hAnsi="Courier New" w:cs="Courier New" w:hint="default"/>
+      </w:rPr>
+    </w:lvl>
+    <w:lvl w:ilvl="8">
+      <w:numFmt w:val="bullet"/>
+      <w:lvlText w:val=""/>
+      <w:lvlJc w:val="left"/>
+      <w:pPr>
+        <w:ind w:left="6480" w:hanging="360"/>
+      </w:pPr>
+      <w:rPr>
+        <w:rFonts w:ascii="Wingdings" w:hAnsi="Wingdings" w:cs="Wingdings" w:hint="default"/>
+      </w:rPr>
+    </w:lvl>
+  </w:abstractNum>
   <w:num w:numId="1000">
     <w:abstractNumId w:val="990"/>
+  </w:num>
+  <w:num w:numId="1001">
+    <w:abstractNumId w:val="991"/>
   </w:num>
 </w:numbering>
 </file>

</xml_diff>